<commit_message>
add new phytologist proof, EL proposal draft
</commit_message>
<xml_diff>
--- a/drafts/newPhyt_submission/CNP_npMeta_CL_v0.1.docx
+++ b/drafts/newPhyt_submission/CNP_npMeta_CL_v0.1.docx
@@ -46,7 +46,13 @@
     </w:p>
     <w:p>
       <w:r>
-        <w:t>May 21, 2026</w:t>
+        <w:t>May 2</w:t>
+      </w:r>
+      <w:r>
+        <w:t>3</w:t>
+      </w:r>
+      <w:r>
+        <w:t>, 2026</w:t>
       </w:r>
     </w:p>
     <w:p>
@@ -85,10 +91,7 @@
         <w:t>. The manuscript contains one table and six figures in the main text, with 14 tables and 18 figures included as supplemental material.</w:t>
       </w:r>
       <w:r>
-        <w:t xml:space="preserve"> </w:t>
-      </w:r>
-      <w:r>
-        <w:t xml:space="preserve">This manuscript is not under consideration elsewhere and there are no conflicts of interest to report. All data and code for this manuscript are publicly available on </w:t>
+        <w:t xml:space="preserve"> This manuscript is not under consideration elsewhere and there are no conflicts of interest to report. All data and code for this manuscript are publicly available on </w:t>
       </w:r>
       <w:proofErr w:type="spellStart"/>
       <w:r>
@@ -132,7 +135,10 @@
         <w:t xml:space="preserve">We compiled </w:t>
       </w:r>
       <w:r>
-        <w:t>4245 observation</w:t>
+        <w:t>5,680</w:t>
+      </w:r>
+      <w:r>
+        <w:t xml:space="preserve"> observation</w:t>
       </w:r>
       <w:r>
         <w:t>s from 9</w:t>
@@ -162,13 +168,31 @@
         <w:t xml:space="preserve">This work explicitly tests four hypotheses rooted in eco-evolutionary optimality theory: (1) N and P addition will increase leaf nutrient content </w:t>
       </w:r>
       <w:r>
-        <w:t>and biomass production, but will have limited direct effects on photosynthetic traits; (2) combined N+P effects will be predomina</w:t>
+        <w:t xml:space="preserve">and biomass production, but will have limited direct effects on photosynthetic traits; (2) combined N+P </w:t>
+      </w:r>
+      <w:r>
+        <w:t>responses</w:t>
+      </w:r>
+      <w:r>
+        <w:t xml:space="preserve"> will be predomina</w:t>
       </w:r>
       <w:r>
         <w:t>nt</w:t>
       </w:r>
       <w:r>
-        <w:t>ly additive; (3) responses will be strongest in cold, dry, and bright environments with high photosynthetic demand; and (4) responses will be strongest in species reliant on inorganic soil nutrient pools (e.g., scavenging mycorrhizal and non-N</w:t>
+        <w:t>ly additive; (3) responses will be strongest in cold, dry, and bright environments with high photosynthetic demand; and (4) responses will be strongest in species</w:t>
+      </w:r>
+      <w:r>
+        <w:t xml:space="preserve"> with acquisition strategies that</w:t>
+      </w:r>
+      <w:r>
+        <w:t xml:space="preserve"> rel</w:t>
+      </w:r>
+      <w:r>
+        <w:t>y</w:t>
+      </w:r>
+      <w:r>
+        <w:t xml:space="preserve"> on inorganic soil nutrient pools (e.g., scavenging mycorrhizal and non-N</w:t>
       </w:r>
       <w:r>
         <w:rPr>
@@ -207,7 +231,13 @@
         <w:t xml:space="preserve">. </w:t>
       </w:r>
       <w:r>
-        <w:t>N and P addition increased leaf nutrient content and biomass production but had limited effects on photosynthetic traits. Combined N+P responses were mostly additive, but leaf N:P stoichiometry and aboveground biomass production show clear synergistic interactions. We demonstrate strong climatic control on area-based leaf nutrient responses, with the strongest effects observed in environments with high photosynthetic demand for soil resources. Finally, we show that mycorrhizal acquisition strategy and N</w:t>
+        <w:t xml:space="preserve">N and P addition increased leaf nutrient content and biomass production but had limited effects on photosynthetic traits. Combined N+P responses were mostly additive, but leaf N:P stoichiometry and aboveground biomass production show clear synergistic interactions. </w:t>
+      </w:r>
+      <w:r>
+        <w:t xml:space="preserve">Climate strongly modified plant responses to nutrient addition, with the strongest effects observed </w:t>
+      </w:r>
+      <w:r>
+        <w:t>in environments with high photosynthetic demand for soil resources. Finally, mycorrhizal acquisition strategy and N</w:t>
       </w:r>
       <w:r>
         <w:rPr>
@@ -216,7 +246,13 @@
         <w:t>2</w:t>
       </w:r>
       <w:r>
-        <w:t>-fixation ability are much stronger moderators than photosynthetic pathway. Together, these findings provide new mechanistic insight into nutrient colimitation and provide new empirical insights needed to refine the way C-N-P interactions are modeled in ecosystem and terrestrial biosphere models.</w:t>
+        <w:t xml:space="preserve">-fixation ability </w:t>
+      </w:r>
+      <w:r>
+        <w:t>were</w:t>
+      </w:r>
+      <w:r>
+        <w:t xml:space="preserve"> much stronger moderators than photosynthetic pathway. Together, these findings provide new mechanistic insight into nutrient colimitation and provide new empirical insights needed to refine the way C-N-P interactions are modeled in ecosystem and terrestrial biosphere models.</w:t>
       </w:r>
     </w:p>
     <w:p>
@@ -277,24 +313,36 @@
         <w:rPr>
           <w:color w:val="000000"/>
         </w:rPr>
-        <w:t xml:space="preserve">models and likely play a strong role in contributing </w:t>
+        <w:t xml:space="preserve">models and play a strong role in contributing </w:t>
       </w:r>
       <w:r>
         <w:rPr>
           <w:color w:val="000000"/>
         </w:rPr>
-        <w:t>to divergent projections of the land carbon sink</w:t>
+        <w:t xml:space="preserve">to divergent </w:t>
       </w:r>
       <w:r>
         <w:rPr>
           <w:color w:val="000000"/>
         </w:rPr>
-        <w:t xml:space="preserve"> across models</w:t>
+        <w:t xml:space="preserve">land carbon sink </w:t>
       </w:r>
       <w:r>
         <w:rPr>
           <w:color w:val="000000"/>
         </w:rPr>
+        <w:t xml:space="preserve">projections </w:t>
+      </w:r>
+      <w:r>
+        <w:rPr>
+          <w:color w:val="000000"/>
+        </w:rPr>
+        <w:t>across models</w:t>
+      </w:r>
+      <w:r>
+        <w:rPr>
+          <w:color w:val="000000"/>
+        </w:rPr>
         <w:t xml:space="preserve">. </w:t>
       </w:r>
       <w:r>
@@ -304,16 +352,22 @@
         <w:t>modified</w:t>
       </w:r>
       <w:r>
-        <w:t xml:space="preserve"> by climate and acquisition strategy, our results </w:t>
+        <w:t xml:space="preserve"> by climate and </w:t>
+      </w:r>
+      <w:r>
+        <w:t xml:space="preserve">nutrient </w:t>
+      </w:r>
+      <w:r>
+        <w:t xml:space="preserve">acquisition strategy, our results </w:t>
       </w:r>
       <w:r>
         <w:t xml:space="preserve">improve understanding of C-N-P interactions and provide an immediate empirical roadmap for </w:t>
       </w:r>
       <w:r>
-        <w:t xml:space="preserve">robustly </w:t>
-      </w:r>
-      <w:r>
-        <w:t>representing these processes in terrestrial biosphere models.</w:t>
+        <w:t xml:space="preserve">refining the representation of coupled C-N-P processes </w:t>
+      </w:r>
+      <w:r>
+        <w:t>in terrestrial biosphere models.</w:t>
       </w:r>
     </w:p>
     <w:p>
@@ -332,8 +386,6 @@
         <w:t>Sincerely,</w:t>
       </w:r>
     </w:p>
-    <w:p/>
-    <w:p/>
     <w:p>
       <w:r>
         <w:t>Evan A. Perkowski, Ph.D.</w:t>

</xml_diff>